<commit_message>
update terbaru pt 4
</commit_message>
<xml_diff>
--- a/Pertemuan 4/NURRAHMATIA - - 4. Worksheet_PABW_Pertemuan4.docx
+++ b/Pertemuan 4/NURRAHMATIA - - 4. Worksheet_PABW_Pertemuan4.docx
@@ -2212,7 +2212,7 @@
               <w:t>#</w:t>
             </w:r>
             <w:r>
-              <w:t>39B2BF</w:t>
+              <w:t>664E3F</w:t>
             </w:r>
           </w:p>
         </w:tc>
@@ -2311,10 +2311,7 @@
               <w:spacing w:before="20" w:after="20" w:line="252" w:lineRule="auto"/>
             </w:pPr>
             <w:r>
-              <w:t>#</w:t>
-            </w:r>
-            <w:r>
-              <w:t>E8DCBC</w:t>
+              <w:t>#F4F9FA</w:t>
             </w:r>
           </w:p>
         </w:tc>
@@ -3110,6 +3107,12 @@
             <w:pPr>
               <w:spacing w:before="20" w:after="20" w:line="252" w:lineRule="auto"/>
             </w:pPr>
+            <w:r>
+              <w:t>0.25</w:t>
+            </w:r>
+            <w:r>
+              <w:t>rem</w:t>
+            </w:r>
           </w:p>
         </w:tc>
       </w:tr>
@@ -3206,6 +3209,9 @@
             <w:pPr>
               <w:spacing w:before="20" w:after="20" w:line="252" w:lineRule="auto"/>
             </w:pPr>
+            <w:r>
+              <w:t>0.8rem</w:t>
+            </w:r>
           </w:p>
         </w:tc>
       </w:tr>
@@ -3298,6 +3304,9 @@
             <w:pPr>
               <w:spacing w:before="20" w:after="20" w:line="252" w:lineRule="auto"/>
             </w:pPr>
+            <w:r>
+              <w:t>0.85rem</w:t>
+            </w:r>
           </w:p>
         </w:tc>
       </w:tr>
@@ -3394,6 +3403,9 @@
             <w:pPr>
               <w:spacing w:before="20" w:after="20" w:line="252" w:lineRule="auto"/>
             </w:pPr>
+            <w:r>
+              <w:t>1rem</w:t>
+            </w:r>
           </w:p>
         </w:tc>
       </w:tr>
@@ -3486,6 +3498,9 @@
             <w:pPr>
               <w:spacing w:before="20" w:after="20" w:line="252" w:lineRule="auto"/>
             </w:pPr>
+            <w:r>
+              <w:t>1.7rem</w:t>
+            </w:r>
           </w:p>
         </w:tc>
       </w:tr>
@@ -3582,6 +3597,9 @@
             <w:pPr>
               <w:spacing w:before="20" w:after="20" w:line="252" w:lineRule="auto"/>
             </w:pPr>
+            <w:r>
+              <w:t>0.5rem</w:t>
+            </w:r>
           </w:p>
         </w:tc>
       </w:tr>
@@ -3674,6 +3692,9 @@
             <w:pPr>
               <w:spacing w:before="20" w:after="20" w:line="252" w:lineRule="auto"/>
             </w:pPr>
+            <w:r>
+              <w:t>999px</w:t>
+            </w:r>
           </w:p>
         </w:tc>
       </w:tr>
@@ -3770,6 +3791,13 @@
             <w:pPr>
               <w:spacing w:before="20" w:after="20" w:line="252" w:lineRule="auto"/>
             </w:pPr>
+            <w:r>
+              <w:rPr>
+                <w:rFonts w:cs="Carlito"/>
+                <w:sz w:val="18"/>
+              </w:rPr>
+              <w:t>0 1px 3px rgba(0,0,0,.10)</w:t>
+            </w:r>
           </w:p>
         </w:tc>
       </w:tr>
@@ -3862,6 +3890,12 @@
             <w:pPr>
               <w:spacing w:before="20" w:after="20" w:line="252" w:lineRule="auto"/>
             </w:pPr>
+            <w:r>
+              <w:t>0.</w:t>
+            </w:r>
+            <w:r>
+              <w:t>875rem</w:t>
+            </w:r>
           </w:p>
         </w:tc>
       </w:tr>
@@ -3958,6 +3992,9 @@
             <w:pPr>
               <w:spacing w:before="20" w:after="20" w:line="252" w:lineRule="auto"/>
             </w:pPr>
+            <w:r>
+              <w:t>1rem</w:t>
+            </w:r>
           </w:p>
         </w:tc>
       </w:tr>
@@ -4050,6 +4087,9 @@
             <w:pPr>
               <w:spacing w:before="20" w:after="20" w:line="252" w:lineRule="auto"/>
             </w:pPr>
+            <w:r>
+              <w:t>1.5rem</w:t>
+            </w:r>
           </w:p>
         </w:tc>
       </w:tr>
@@ -4146,6 +4186,9 @@
             <w:pPr>
               <w:spacing w:before="20" w:after="20" w:line="252" w:lineRule="auto"/>
             </w:pPr>
+            <w:r>
+              <w:t>2.25rem</w:t>
+            </w:r>
           </w:p>
         </w:tc>
       </w:tr>
@@ -4768,6 +4811,11 @@
           </w:tcPr>
           <w:p>
             <w:pPr>
+              <w:pStyle w:val="ListParagraph"/>
+              <w:numPr>
+                <w:ilvl w:val="0"/>
+                <w:numId w:val="11"/>
+              </w:numPr>
               <w:spacing w:before="20" w:after="20" w:line="252" w:lineRule="auto"/>
             </w:pPr>
           </w:p>
@@ -5541,6 +5589,11 @@
           </w:tcPr>
           <w:p>
             <w:pPr>
+              <w:pStyle w:val="ListParagraph"/>
+              <w:numPr>
+                <w:ilvl w:val="0"/>
+                <w:numId w:val="10"/>
+              </w:numPr>
               <w:spacing w:before="20" w:after="20" w:line="252" w:lineRule="auto"/>
             </w:pPr>
           </w:p>
@@ -5589,6 +5642,11 @@
           </w:tcPr>
           <w:p>
             <w:pPr>
+              <w:pStyle w:val="ListParagraph"/>
+              <w:numPr>
+                <w:ilvl w:val="0"/>
+                <w:numId w:val="10"/>
+              </w:numPr>
               <w:spacing w:before="20" w:after="20" w:line="252" w:lineRule="auto"/>
             </w:pPr>
           </w:p>
@@ -5635,6 +5693,11 @@
           </w:tcPr>
           <w:p>
             <w:pPr>
+              <w:pStyle w:val="ListParagraph"/>
+              <w:numPr>
+                <w:ilvl w:val="0"/>
+                <w:numId w:val="10"/>
+              </w:numPr>
               <w:spacing w:before="20" w:after="20" w:line="252" w:lineRule="auto"/>
             </w:pPr>
           </w:p>
@@ -6698,6 +6761,13 @@
               </w:rPr>
               <w:t>C</w:t>
             </w:r>
+            <w:r>
+              <w:rPr>
+                <w:rFonts w:cs="Carlito"/>
+                <w:sz w:val="19"/>
+              </w:rPr>
+              <w:t xml:space="preserve"> (sudah)</w:t>
+            </w:r>
           </w:p>
         </w:tc>
       </w:tr>
@@ -6766,6 +6836,9 @@
           </w:tcPr>
           <w:p>
             <w:pPr>
+              <w:tabs>
+                <w:tab w:val="center" w:pos="1082"/>
+              </w:tabs>
               <w:spacing w:before="20" w:after="20" w:line="252" w:lineRule="auto"/>
             </w:pPr>
             <w:r>
@@ -6774,6 +6847,13 @@
                 <w:sz w:val="19"/>
               </w:rPr>
               <w:t>D</w:t>
+            </w:r>
+            <w:r>
+              <w:rPr>
+                <w:rFonts w:cs="Carlito"/>
+                <w:sz w:val="19"/>
+              </w:rPr>
+              <w:t xml:space="preserve"> (sudah)</w:t>
             </w:r>
           </w:p>
         </w:tc>
@@ -6854,6 +6934,13 @@
               </w:rPr>
               <w:t>D dan E</w:t>
             </w:r>
+            <w:r>
+              <w:rPr>
+                <w:rFonts w:cs="Carlito"/>
+                <w:sz w:val="19"/>
+              </w:rPr>
+              <w:t xml:space="preserve"> (sudah)</w:t>
+            </w:r>
           </w:p>
         </w:tc>
       </w:tr>
@@ -6929,6 +7016,13 @@
                 <w:sz w:val="19"/>
               </w:rPr>
               <w:t>F</w:t>
+            </w:r>
+            <w:r>
+              <w:rPr>
+                <w:rFonts w:cs="Carlito"/>
+                <w:sz w:val="19"/>
+              </w:rPr>
+              <w:t xml:space="preserve"> (sudah)</w:t>
             </w:r>
           </w:p>
         </w:tc>
@@ -24471,115 +24565,7 @@
         <w:color w:val="5A6080"/>
         <w:sz w:val="15"/>
       </w:rPr>
-      <w:t>PABW 2026/</w:t>
-    </w:r>
-    <w:proofErr w:type="gramStart"/>
-    <w:r>
-      <w:rPr>
-        <w:rFonts w:cs="Carlito"/>
-        <w:color w:val="5A6080"/>
-        <w:sz w:val="15"/>
-      </w:rPr>
-      <w:t>2027  ·</w:t>
-    </w:r>
-    <w:proofErr w:type="gramEnd"/>
-    <w:r>
-      <w:rPr>
-        <w:rFonts w:cs="Carlito"/>
-        <w:color w:val="5A6080"/>
-        <w:sz w:val="15"/>
-      </w:rPr>
-      <w:t xml:space="preserve">  </w:t>
-    </w:r>
-    <w:proofErr w:type="spellStart"/>
-    <w:r>
-      <w:rPr>
-        <w:rFonts w:cs="Carlito"/>
-        <w:color w:val="5A6080"/>
-        <w:sz w:val="15"/>
-      </w:rPr>
-      <w:t>Pertemuan</w:t>
-    </w:r>
-    <w:proofErr w:type="spellEnd"/>
-    <w:r>
-      <w:rPr>
-        <w:rFonts w:cs="Carlito"/>
-        <w:color w:val="5A6080"/>
-        <w:sz w:val="15"/>
-      </w:rPr>
-      <w:t xml:space="preserve"> </w:t>
-    </w:r>
-    <w:proofErr w:type="gramStart"/>
-    <w:r>
-      <w:rPr>
-        <w:rFonts w:cs="Carlito"/>
-        <w:color w:val="5A6080"/>
-        <w:sz w:val="15"/>
-      </w:rPr>
-      <w:t>4  ·</w:t>
-    </w:r>
-    <w:proofErr w:type="gramEnd"/>
-    <w:r>
-      <w:rPr>
-        <w:rFonts w:cs="Carlito"/>
-        <w:color w:val="5A6080"/>
-        <w:sz w:val="15"/>
-      </w:rPr>
-      <w:t xml:space="preserve">  CSS Fundamental dan Design </w:t>
-    </w:r>
-    <w:proofErr w:type="gramStart"/>
-    <w:r>
-      <w:rPr>
-        <w:rFonts w:cs="Carlito"/>
-        <w:color w:val="5A6080"/>
-        <w:sz w:val="15"/>
-      </w:rPr>
-      <w:t>Token  ·</w:t>
-    </w:r>
-    <w:proofErr w:type="gramEnd"/>
-    <w:r>
-      <w:rPr>
-        <w:rFonts w:cs="Carlito"/>
-        <w:color w:val="5A6080"/>
-        <w:sz w:val="15"/>
-      </w:rPr>
-      <w:t xml:space="preserve">  Universitas Islam </w:t>
-    </w:r>
-    <w:proofErr w:type="gramStart"/>
-    <w:r>
-      <w:rPr>
-        <w:rFonts w:cs="Carlito"/>
-        <w:color w:val="5A6080"/>
-        <w:sz w:val="15"/>
-      </w:rPr>
-      <w:t>Indonesia  ·</w:t>
-    </w:r>
-    <w:proofErr w:type="gramEnd"/>
-    <w:r>
-      <w:rPr>
-        <w:rFonts w:cs="Carlito"/>
-        <w:color w:val="5A6080"/>
-        <w:sz w:val="15"/>
-      </w:rPr>
-      <w:t xml:space="preserve">  </w:t>
-    </w:r>
-    <w:proofErr w:type="spellStart"/>
-    <w:r>
-      <w:rPr>
-        <w:rFonts w:cs="Carlito"/>
-        <w:color w:val="5A6080"/>
-        <w:sz w:val="15"/>
-      </w:rPr>
-      <w:t>halaman</w:t>
-    </w:r>
-    <w:proofErr w:type="spellEnd"/>
-    <w:r>
-      <w:rPr>
-        <w:rFonts w:cs="Carlito"/>
-        <w:color w:val="5A6080"/>
-        <w:sz w:val="15"/>
-      </w:rPr>
-      <w:t xml:space="preserve"> </w:t>
+      <w:t xml:space="preserve">PABW 2026/2027  ·  Pertemuan 4  ·  CSS Fundamental dan Design Token  ·  Universitas Islam Indonesia  ·  halaman </w:t>
     </w:r>
     <w:r>
       <w:fldChar w:fldCharType="begin"/>
@@ -24807,9 +24793,122 @@
     </w:lvl>
   </w:abstractNum>
   <w:abstractNum w:abstractNumId="9" w15:restartNumberingAfterBreak="0">
+    <w:nsid w:val="54271BCC"/>
+    <w:multiLevelType w:val="hybridMultilevel"/>
+    <w:tmpl w:val="517EB5B8"/>
+    <w:lvl w:ilvl="0" w:tplc="0409000D">
+      <w:start w:val="1"/>
+      <w:numFmt w:val="bullet"/>
+      <w:lvlText w:val=""/>
+      <w:lvlJc w:val="left"/>
+      <w:pPr>
+        <w:ind w:left="720" w:hanging="360"/>
+      </w:pPr>
+      <w:rPr>
+        <w:rFonts w:ascii="Wingdings" w:hAnsi="Wingdings" w:hint="default"/>
+      </w:rPr>
+    </w:lvl>
+    <w:lvl w:ilvl="1" w:tplc="04090003" w:tentative="1">
+      <w:start w:val="1"/>
+      <w:numFmt w:val="bullet"/>
+      <w:lvlText w:val="o"/>
+      <w:lvlJc w:val="left"/>
+      <w:pPr>
+        <w:ind w:left="1440" w:hanging="360"/>
+      </w:pPr>
+      <w:rPr>
+        <w:rFonts w:ascii="Courier New" w:hAnsi="Courier New" w:cs="Courier New" w:hint="default"/>
+      </w:rPr>
+    </w:lvl>
+    <w:lvl w:ilvl="2" w:tplc="04090005" w:tentative="1">
+      <w:start w:val="1"/>
+      <w:numFmt w:val="bullet"/>
+      <w:lvlText w:val=""/>
+      <w:lvlJc w:val="left"/>
+      <w:pPr>
+        <w:ind w:left="2160" w:hanging="360"/>
+      </w:pPr>
+      <w:rPr>
+        <w:rFonts w:ascii="Wingdings" w:hAnsi="Wingdings" w:hint="default"/>
+      </w:rPr>
+    </w:lvl>
+    <w:lvl w:ilvl="3" w:tplc="04090001" w:tentative="1">
+      <w:start w:val="1"/>
+      <w:numFmt w:val="bullet"/>
+      <w:lvlText w:val=""/>
+      <w:lvlJc w:val="left"/>
+      <w:pPr>
+        <w:ind w:left="2880" w:hanging="360"/>
+      </w:pPr>
+      <w:rPr>
+        <w:rFonts w:ascii="Symbol" w:hAnsi="Symbol" w:hint="default"/>
+      </w:rPr>
+    </w:lvl>
+    <w:lvl w:ilvl="4" w:tplc="04090003" w:tentative="1">
+      <w:start w:val="1"/>
+      <w:numFmt w:val="bullet"/>
+      <w:lvlText w:val="o"/>
+      <w:lvlJc w:val="left"/>
+      <w:pPr>
+        <w:ind w:left="3600" w:hanging="360"/>
+      </w:pPr>
+      <w:rPr>
+        <w:rFonts w:ascii="Courier New" w:hAnsi="Courier New" w:cs="Courier New" w:hint="default"/>
+      </w:rPr>
+    </w:lvl>
+    <w:lvl w:ilvl="5" w:tplc="04090005" w:tentative="1">
+      <w:start w:val="1"/>
+      <w:numFmt w:val="bullet"/>
+      <w:lvlText w:val=""/>
+      <w:lvlJc w:val="left"/>
+      <w:pPr>
+        <w:ind w:left="4320" w:hanging="360"/>
+      </w:pPr>
+      <w:rPr>
+        <w:rFonts w:ascii="Wingdings" w:hAnsi="Wingdings" w:hint="default"/>
+      </w:rPr>
+    </w:lvl>
+    <w:lvl w:ilvl="6" w:tplc="04090001" w:tentative="1">
+      <w:start w:val="1"/>
+      <w:numFmt w:val="bullet"/>
+      <w:lvlText w:val=""/>
+      <w:lvlJc w:val="left"/>
+      <w:pPr>
+        <w:ind w:left="5040" w:hanging="360"/>
+      </w:pPr>
+      <w:rPr>
+        <w:rFonts w:ascii="Symbol" w:hAnsi="Symbol" w:hint="default"/>
+      </w:rPr>
+    </w:lvl>
+    <w:lvl w:ilvl="7" w:tplc="04090003" w:tentative="1">
+      <w:start w:val="1"/>
+      <w:numFmt w:val="bullet"/>
+      <w:lvlText w:val="o"/>
+      <w:lvlJc w:val="left"/>
+      <w:pPr>
+        <w:ind w:left="5760" w:hanging="360"/>
+      </w:pPr>
+      <w:rPr>
+        <w:rFonts w:ascii="Courier New" w:hAnsi="Courier New" w:cs="Courier New" w:hint="default"/>
+      </w:rPr>
+    </w:lvl>
+    <w:lvl w:ilvl="8" w:tplc="04090005" w:tentative="1">
+      <w:start w:val="1"/>
+      <w:numFmt w:val="bullet"/>
+      <w:lvlText w:val=""/>
+      <w:lvlJc w:val="left"/>
+      <w:pPr>
+        <w:ind w:left="6480" w:hanging="360"/>
+      </w:pPr>
+      <w:rPr>
+        <w:rFonts w:ascii="Wingdings" w:hAnsi="Wingdings" w:hint="default"/>
+      </w:rPr>
+    </w:lvl>
+  </w:abstractNum>
+  <w:abstractNum w:abstractNumId="10" w15:restartNumberingAfterBreak="0">
     <w:nsid w:val="5C8A6492"/>
     <w:multiLevelType w:val="hybridMultilevel"/>
-    <w:tmpl w:val="08666E62"/>
+    <w:tmpl w:val="D5942754"/>
     <w:lvl w:ilvl="0" w:tplc="0409000D">
       <w:start w:val="1"/>
       <w:numFmt w:val="bullet"/>
@@ -24947,6 +25046,9 @@
     <w:abstractNumId w:val="0"/>
   </w:num>
   <w:num w:numId="10" w16cid:durableId="28724674">
+    <w:abstractNumId w:val="10"/>
+  </w:num>
+  <w:num w:numId="11" w16cid:durableId="62408410">
     <w:abstractNumId w:val="9"/>
   </w:num>
 </w:numbering>
@@ -25562,7 +25664,6 @@
   <w:style w:type="character" w:default="1" w:styleId="DefaultParagraphFont">
     <w:name w:val="Default Paragraph Font"/>
     <w:uiPriority w:val="1"/>
-    <w:semiHidden/>
     <w:unhideWhenUsed/>
   </w:style>
   <w:style w:type="table" w:default="1" w:styleId="TableNormal">

</xml_diff>

<commit_message>
update html dan css
</commit_message>
<xml_diff>
--- a/Pertemuan 4/NURRAHMATIA - - 4. Worksheet_PABW_Pertemuan4.docx
+++ b/Pertemuan 4/NURRAHMATIA - - 4. Worksheet_PABW_Pertemuan4.docx
@@ -3504,7 +3504,13 @@
               <w:spacing w:before="20" w:after="20" w:line="252" w:lineRule="auto"/>
             </w:pPr>
             <w:r>
-              <w:t>1.7rem</w:t>
+              <w:t>1.</w:t>
+            </w:r>
+            <w:r>
+              <w:t>5</w:t>
+            </w:r>
+            <w:r>
+              <w:t>rem</w:t>
             </w:r>
           </w:p>
         </w:tc>
@@ -11860,6 +11866,9 @@
             <w:pPr>
               <w:spacing w:before="20" w:after="20" w:line="252" w:lineRule="auto"/>
             </w:pPr>
+            <w:r>
+              <w:t>Sesuai</w:t>
+            </w:r>
           </w:p>
         </w:tc>
       </w:tr>
@@ -11932,6 +11941,9 @@
             <w:pPr>
               <w:spacing w:before="20" w:after="20" w:line="252" w:lineRule="auto"/>
             </w:pPr>
+            <w:r>
+              <w:t xml:space="preserve">Sesuai </w:t>
+            </w:r>
           </w:p>
         </w:tc>
       </w:tr>
@@ -12001,6 +12013,9 @@
             <w:pPr>
               <w:spacing w:before="20" w:after="20" w:line="252" w:lineRule="auto"/>
             </w:pPr>
+            <w:r>
+              <w:t xml:space="preserve">Sesuai </w:t>
+            </w:r>
           </w:p>
         </w:tc>
       </w:tr>
@@ -12073,6 +12088,9 @@
             <w:pPr>
               <w:spacing w:before="20" w:after="20" w:line="252" w:lineRule="auto"/>
             </w:pPr>
+            <w:r>
+              <w:t>Sesuai</w:t>
+            </w:r>
           </w:p>
         </w:tc>
       </w:tr>
@@ -14348,6 +14366,9 @@
             <w:pPr>
               <w:spacing w:before="20" w:after="20" w:line="252" w:lineRule="auto"/>
             </w:pPr>
+            <w:r>
+              <w:t>Kotak terlihat jelas pada setiap elemen</w:t>
+            </w:r>
           </w:p>
         </w:tc>
       </w:tr>
@@ -14420,6 +14441,9 @@
             <w:pPr>
               <w:spacing w:before="20" w:after="20" w:line="252" w:lineRule="auto"/>
             </w:pPr>
+            <w:r>
+              <w:t>Garis focus terlihat dan tidak ada yang terpotong</w:t>
+            </w:r>
           </w:p>
         </w:tc>
       </w:tr>
@@ -14489,6 +14513,9 @@
             <w:pPr>
               <w:spacing w:before="20" w:after="20" w:line="252" w:lineRule="auto"/>
             </w:pPr>
+            <w:r>
+              <w:t xml:space="preserve">Tidak ada tanda merah apapun </w:t>
+            </w:r>
           </w:p>
         </w:tc>
       </w:tr>
@@ -14561,6 +14588,18 @@
             <w:pPr>
               <w:spacing w:before="20" w:after="20" w:line="252" w:lineRule="auto"/>
             </w:pPr>
+            <w:r>
+              <w:t xml:space="preserve">Ada garis </w:t>
+            </w:r>
+            <w:r>
+              <w:t>p</w:t>
+            </w:r>
+            <w:r>
+              <w:t xml:space="preserve">eringatan </w:t>
+            </w:r>
+            <w:r>
+              <w:t xml:space="preserve"> dan pesan muncul</w:t>
+            </w:r>
           </w:p>
         </w:tc>
       </w:tr>
@@ -14630,6 +14669,12 @@
             <w:pPr>
               <w:spacing w:before="20" w:after="20" w:line="252" w:lineRule="auto"/>
             </w:pPr>
+            <w:r>
+              <w:t xml:space="preserve">Tanda peringatan </w:t>
+            </w:r>
+            <w:r>
+              <w:t>dapat hilang sendirinya</w:t>
+            </w:r>
           </w:p>
         </w:tc>
       </w:tr>
@@ -14680,6 +14725,7 @@
           <w:rFonts w:cs="Carlito"/>
           <w:sz w:val="20"/>
         </w:rPr>
+        <w:lastRenderedPageBreak/>
         <w:t>Lembar E sudah selesai? Simpan hasilnya sekarang, jangan menunggu kelas berakhir. Perintah Git dijalankan dari dalam folder ~/pabw, tempat repositori Anda disalin pada Pertemuan 3.</w:t>
       </w:r>
     </w:p>
@@ -14695,7 +14741,6 @@
           <w:color w:val="5A6080"/>
           <w:sz w:val="17"/>
         </w:rPr>
-        <w:lastRenderedPageBreak/>
         <w:t>E — simpan perubahan</w:t>
       </w:r>
     </w:p>
@@ -20726,12 +20771,7 @@
         <w:t>Cara memastikan: buka halaman repositori Anda. Folder worksheet-p4/ harus memuat profil.html, gambar, dan keempat berkas CSS. Ini commit terakhir pertemuan ini.</w:t>
       </w:r>
     </w:p>
-    <w:p>
-      <w:r>
-        <w:lastRenderedPageBreak/>
-        <w:br w:type="page"/>
-      </w:r>
-    </w:p>
+    <w:p/>
     <w:tbl>
       <w:tblPr>
         <w:tblW w:w="0" w:type="auto"/>
@@ -20767,7 +20807,6 @@
                 <w:color w:val="FFFFFF"/>
                 <w:sz w:val="22"/>
               </w:rPr>
-              <w:lastRenderedPageBreak/>
               <w:t>WORKSHEET</w:t>
             </w:r>
           </w:p>

</xml_diff>